<commit_message>
Add merge placeholders to Affordability Assessment and Loan Agreement
Both templates were static fill-in-the-blank forms with no ${...} tags,
so the earlier deploy could only hand them out blank. This adds real
placeholders at the fields we have reliable data for (applicant
identity/contact, employer, bank details, requested amount, and -- for
affordability -- income/expense/DTI figures pulled from the AI/CSV bank
analysis when available, falling back to gross salary). Commercial loan
terms (rate, schedule, installment) and physical signing details are
intentionally left blank since they aren't known at application stage.

Extends DocumentFieldResolver with a bank-analysis context lookup and
computed fields for the new placeholders.
</commit_message>
<xml_diff>
--- a/storage/document_templates/APPLICATION_LOAN_AGREEMENT_20260717053301.docx
+++ b/storage/document_templates/APPLICATION_LOAN_AGREEMENT_20260717053301.docx
@@ -399,24 +399,6 @@
     </w:p>
     <w:p>
       <w:pPr>
-        <w:ind w:right="-432"/>
-        <w:rPr>
-          <w:rFonts w:ascii="Arial" w:hAnsi="Arial" w:cs="Arial"/>
-          <w:sz w:val="16"/>
-          <w:szCs w:val="16"/>
-        </w:rPr>
-      </w:pPr>
-      <w:r>
-        <w:rPr>
-          <w:rFonts w:ascii="Arial" w:hAnsi="Arial" w:cs="Arial"/>
-          <w:sz w:val="16"/>
-          <w:szCs w:val="16"/>
-        </w:rPr>
-        <w:t>Entered into between:</w:t>
-      </w:r>
-    </w:p>
-    <w:p>
-      <w:pPr>
         <w:pStyle w:val="Heading1"/>
         <w:ind w:right="-432"/>
         <w:jc w:val="left"/>
@@ -426,37 +408,22 @@
           <w:szCs w:val="16"/>
         </w:rPr>
       </w:pPr>
-    </w:p>
-    <w:p>
-      <w:pPr>
-        <w:pStyle w:val="Heading1"/>
-        <w:ind w:right="-432"/>
-        <w:jc w:val="left"/>
+      <w:r>
         <w:rPr>
           <w:rFonts w:cs="Arial"/>
           <w:sz w:val="16"/>
           <w:szCs w:val="16"/>
         </w:rPr>
-      </w:pPr>
-    </w:p>
-    <w:p>
-      <w:pPr>
-        <w:pStyle w:val="Heading1"/>
-        <w:ind w:right="-432"/>
-        <w:jc w:val="left"/>
+        <w:t>Entered into between:</w:t>
+      </w:r>
+      <w:r>
         <w:rPr>
           <w:rFonts w:cs="Arial"/>
-          <w:sz w:val="16"/>
-          <w:szCs w:val="16"/>
-        </w:rPr>
-      </w:pPr>
-      <w:r>
-        <w:rPr>
-          <w:rFonts w:cs="Arial"/>
-          <w:sz w:val="16"/>
-          <w:szCs w:val="16"/>
-        </w:rPr>
-        <w:t>_________________________</w:t>
+          <w:b w:val="0"/>
+          <w:sz w:val="16"/>
+          <w:szCs w:val="16"/>
+        </w:rPr>
+        <w:t xml:space="preserve"> ${lender_name} </w:t>
       </w:r>
       <w:r>
         <w:rPr>
@@ -629,7 +596,7 @@
           <w:sz w:val="16"/>
           <w:szCs w:val="16"/>
         </w:rPr>
-        <w:t>______________________________</w:t>
+        <w:t xml:space="preserve">${email_address} </w:t>
       </w:r>
     </w:p>
     <w:p>
@@ -667,15 +634,15 @@
           <w:sz w:val="16"/>
           <w:szCs w:val="16"/>
         </w:rPr>
-        <w:t>Residential address: __________________________________________________________________________</w:t>
-      </w:r>
-      <w:r>
-        <w:rPr>
-          <w:rFonts w:ascii="Arial" w:hAnsi="Arial" w:cs="Arial"/>
-          <w:sz w:val="16"/>
-          <w:szCs w:val="16"/>
-        </w:rPr>
-        <w:t>__</w:t>
+        <w:t xml:space="preserve">Residential address: </w:t>
+      </w:r>
+      <w:r>
+        <w:rPr>
+          <w:rFonts w:ascii="Arial" w:hAnsi="Arial" w:cs="Arial"/>
+          <w:sz w:val="16"/>
+          <w:szCs w:val="16"/>
+        </w:rPr>
+        <w:t xml:space="preserve">${residential_address} </w:t>
       </w:r>
     </w:p>
     <w:p>
@@ -714,15 +681,15 @@
           <w:szCs w:val="16"/>
         </w:rPr>
         <w:tab/>
-        <w:t>I.D./Passport No: _____________________________________</w:t>
-      </w:r>
-      <w:r>
-        <w:rPr>
-          <w:rFonts w:ascii="Arial" w:hAnsi="Arial" w:cs="Arial"/>
-          <w:sz w:val="16"/>
-          <w:szCs w:val="16"/>
-        </w:rPr>
-        <w:t>_</w:t>
+        <w:t xml:space="preserve">I.D./Passport No: </w:t>
+      </w:r>
+      <w:r>
+        <w:rPr>
+          <w:rFonts w:ascii="Arial" w:hAnsi="Arial" w:cs="Arial"/>
+          <w:sz w:val="16"/>
+          <w:szCs w:val="16"/>
+        </w:rPr>
+        <w:t xml:space="preserve">${id_number} </w:t>
       </w:r>
     </w:p>
     <w:p>
@@ -815,23 +782,23 @@
           <w:sz w:val="16"/>
           <w:szCs w:val="16"/>
         </w:rPr>
-        <w:t>Employer Name: _____</w:t>
-      </w:r>
-      <w:r>
-        <w:rPr>
-          <w:rFonts w:ascii="Arial" w:hAnsi="Arial" w:cs="Arial"/>
-          <w:sz w:val="16"/>
-          <w:szCs w:val="16"/>
-        </w:rPr>
-        <w:t>______________________________</w:t>
-      </w:r>
-      <w:r>
-        <w:rPr>
-          <w:rFonts w:ascii="Arial" w:hAnsi="Arial" w:cs="Arial"/>
-          <w:sz w:val="16"/>
-          <w:szCs w:val="16"/>
-        </w:rPr>
-        <w:t>_ Employer</w:t>
+        <w:t xml:space="preserve">Employer Name: </w:t>
+      </w:r>
+      <w:r>
+        <w:rPr>
+          <w:rFonts w:ascii="Arial" w:hAnsi="Arial" w:cs="Arial"/>
+          <w:sz w:val="16"/>
+          <w:szCs w:val="16"/>
+        </w:rPr>
+        <w:t xml:space="preserve">${employer_name} </w:t>
+      </w:r>
+      <w:r>
+        <w:rPr>
+          <w:rFonts w:ascii="Arial" w:hAnsi="Arial" w:cs="Arial"/>
+          <w:sz w:val="16"/>
+          <w:szCs w:val="16"/>
+        </w:rPr>
+        <w:t xml:space="preserve"> Employer</w:t>
       </w:r>
       <w:r>
         <w:rPr>
@@ -885,7 +852,15 @@
           <w:sz w:val="16"/>
           <w:szCs w:val="16"/>
         </w:rPr>
-        <w:t>Payslip/Employee No: __________________</w:t>
+        <w:t xml:space="preserve">Payslip/Employee No: </w:t>
+      </w:r>
+      <w:r>
+        <w:rPr>
+          <w:rFonts w:ascii="Arial" w:hAnsi="Arial" w:cs="Arial"/>
+          <w:sz w:val="16"/>
+          <w:szCs w:val="16"/>
+        </w:rPr>
+        <w:t xml:space="preserve">${employee_no} </w:t>
       </w:r>
     </w:p>
     <w:p>
@@ -915,7 +890,15 @@
           <w:sz w:val="16"/>
           <w:szCs w:val="16"/>
         </w:rPr>
-        <w:t>Bank: __________________________________</w:t>
+        <w:t xml:space="preserve">Bank: </w:t>
+      </w:r>
+      <w:r>
+        <w:rPr>
+          <w:rFonts w:ascii="Arial" w:hAnsi="Arial" w:cs="Arial"/>
+          <w:sz w:val="16"/>
+          <w:szCs w:val="16"/>
+        </w:rPr>
+        <w:t xml:space="preserve">${bank_name} </w:t>
       </w:r>
       <w:r>
         <w:rPr>
@@ -940,7 +923,15 @@
           <w:szCs w:val="16"/>
         </w:rPr>
         <w:tab/>
-        <w:t>Branch: _____________________________</w:t>
+        <w:t xml:space="preserve">Branch: </w:t>
+      </w:r>
+      <w:r>
+        <w:rPr>
+          <w:rFonts w:ascii="Arial" w:hAnsi="Arial" w:cs="Arial"/>
+          <w:sz w:val="16"/>
+          <w:szCs w:val="16"/>
+        </w:rPr>
+        <w:t xml:space="preserve">${bank_branch} </w:t>
       </w:r>
     </w:p>
     <w:p>
@@ -970,7 +961,15 @@
           <w:sz w:val="16"/>
           <w:szCs w:val="16"/>
         </w:rPr>
-        <w:t>Bank Account No: ___________________________________</w:t>
+        <w:t xml:space="preserve">Bank Account No: </w:t>
+      </w:r>
+      <w:r>
+        <w:rPr>
+          <w:rFonts w:ascii="Arial" w:hAnsi="Arial" w:cs="Arial"/>
+          <w:sz w:val="16"/>
+          <w:szCs w:val="16"/>
+        </w:rPr>
+        <w:t xml:space="preserve">${bank_account_no} </w:t>
       </w:r>
       <w:r>
         <w:rPr>
@@ -8023,7 +8022,7 @@
         <w:rStyle w:val="PageNumber"/>
         <w:noProof/>
       </w:rPr>
-      <w:t>2</w:t>
+      <w:t>3</w:t>
     </w:r>
     <w:r>
       <w:rPr>
@@ -11473,6 +11472,50 @@
     <w:lsdException w:name="Subtitle" w:qFormat="1"/>
     <w:lsdException w:name="Strong" w:qFormat="1"/>
     <w:lsdException w:name="Emphasis" w:qFormat="1"/>
+    <w:lsdException w:name="Normal Table" w:semiHidden="1" w:unhideWhenUsed="1"/>
+    <w:lsdException w:name="Table Simple 1" w:semiHidden="1" w:unhideWhenUsed="1"/>
+    <w:lsdException w:name="Table Simple 2" w:semiHidden="1" w:unhideWhenUsed="1"/>
+    <w:lsdException w:name="Table Simple 3" w:semiHidden="1" w:unhideWhenUsed="1"/>
+    <w:lsdException w:name="Table Classic 1" w:semiHidden="1" w:unhideWhenUsed="1"/>
+    <w:lsdException w:name="Table Classic 2" w:semiHidden="1" w:unhideWhenUsed="1"/>
+    <w:lsdException w:name="Table Classic 3" w:semiHidden="1" w:unhideWhenUsed="1"/>
+    <w:lsdException w:name="Table Classic 4" w:semiHidden="1" w:unhideWhenUsed="1"/>
+    <w:lsdException w:name="Table Colorful 1" w:semiHidden="1" w:unhideWhenUsed="1"/>
+    <w:lsdException w:name="Table Colorful 2" w:semiHidden="1" w:unhideWhenUsed="1"/>
+    <w:lsdException w:name="Table Colorful 3" w:semiHidden="1" w:unhideWhenUsed="1"/>
+    <w:lsdException w:name="Table Columns 1" w:semiHidden="1" w:unhideWhenUsed="1"/>
+    <w:lsdException w:name="Table Columns 2" w:semiHidden="1" w:unhideWhenUsed="1"/>
+    <w:lsdException w:name="Table Columns 3" w:semiHidden="1" w:unhideWhenUsed="1"/>
+    <w:lsdException w:name="Table Columns 4" w:semiHidden="1" w:unhideWhenUsed="1"/>
+    <w:lsdException w:name="Table Columns 5" w:semiHidden="1" w:unhideWhenUsed="1"/>
+    <w:lsdException w:name="Table Grid 1" w:semiHidden="1" w:unhideWhenUsed="1"/>
+    <w:lsdException w:name="Table Grid 2" w:semiHidden="1" w:unhideWhenUsed="1"/>
+    <w:lsdException w:name="Table Grid 3" w:semiHidden="1" w:unhideWhenUsed="1"/>
+    <w:lsdException w:name="Table Grid 4" w:semiHidden="1" w:unhideWhenUsed="1"/>
+    <w:lsdException w:name="Table Grid 5" w:semiHidden="1" w:unhideWhenUsed="1"/>
+    <w:lsdException w:name="Table Grid 6" w:semiHidden="1" w:unhideWhenUsed="1"/>
+    <w:lsdException w:name="Table Grid 7" w:semiHidden="1" w:unhideWhenUsed="1"/>
+    <w:lsdException w:name="Table Grid 8" w:semiHidden="1" w:unhideWhenUsed="1"/>
+    <w:lsdException w:name="Table List 1" w:semiHidden="1" w:unhideWhenUsed="1"/>
+    <w:lsdException w:name="Table List 2" w:semiHidden="1" w:unhideWhenUsed="1"/>
+    <w:lsdException w:name="Table List 3" w:semiHidden="1" w:unhideWhenUsed="1"/>
+    <w:lsdException w:name="Table List 4" w:semiHidden="1" w:unhideWhenUsed="1"/>
+    <w:lsdException w:name="Table List 5" w:semiHidden="1" w:unhideWhenUsed="1"/>
+    <w:lsdException w:name="Table List 6" w:semiHidden="1" w:unhideWhenUsed="1"/>
+    <w:lsdException w:name="Table List 7" w:semiHidden="1" w:unhideWhenUsed="1"/>
+    <w:lsdException w:name="Table List 8" w:semiHidden="1" w:unhideWhenUsed="1"/>
+    <w:lsdException w:name="Table 3D effects 1" w:semiHidden="1" w:unhideWhenUsed="1"/>
+    <w:lsdException w:name="Table 3D effects 2" w:semiHidden="1" w:unhideWhenUsed="1"/>
+    <w:lsdException w:name="Table 3D effects 3" w:semiHidden="1" w:unhideWhenUsed="1"/>
+    <w:lsdException w:name="Table Contemporary" w:semiHidden="1" w:unhideWhenUsed="1"/>
+    <w:lsdException w:name="Table Elegant" w:semiHidden="1" w:unhideWhenUsed="1"/>
+    <w:lsdException w:name="Table Professional" w:semiHidden="1" w:unhideWhenUsed="1"/>
+    <w:lsdException w:name="Table Subtle 1" w:semiHidden="1" w:unhideWhenUsed="1"/>
+    <w:lsdException w:name="Table Subtle 2" w:semiHidden="1" w:unhideWhenUsed="1"/>
+    <w:lsdException w:name="Table Web 1" w:semiHidden="1" w:unhideWhenUsed="1"/>
+    <w:lsdException w:name="Table Web 2" w:semiHidden="1" w:unhideWhenUsed="1"/>
+    <w:lsdException w:name="Table Web 3" w:semiHidden="1" w:unhideWhenUsed="1"/>
+    <w:lsdException w:name="Table Theme" w:semiHidden="1" w:unhideWhenUsed="1"/>
     <w:lsdException w:name="Placeholder Text" w:semiHidden="1" w:uiPriority="99"/>
     <w:lsdException w:name="No Spacing" w:uiPriority="1" w:qFormat="1"/>
     <w:lsdException w:name="Light Shading" w:uiPriority="60"/>
@@ -11714,11 +11757,15 @@
   </w:style>
   <w:style w:type="character" w:default="1" w:styleId="DefaultParagraphFont">
     <w:name w:val="Default Paragraph Font"/>
+    <w:uiPriority w:val="1"/>
     <w:semiHidden/>
+    <w:unhideWhenUsed/>
   </w:style>
   <w:style w:type="table" w:default="1" w:styleId="TableNormal">
     <w:name w:val="Normal Table"/>
+    <w:uiPriority w:val="99"/>
     <w:semiHidden/>
+    <w:unhideWhenUsed/>
     <w:tblPr>
       <w:tblInd w:w="0" w:type="dxa"/>
       <w:tblCellMar>
@@ -11731,7 +11778,9 @@
   </w:style>
   <w:style w:type="numbering" w:default="1" w:styleId="NoList">
     <w:name w:val="No List"/>
+    <w:uiPriority w:val="99"/>
     <w:semiHidden/>
+    <w:unhideWhenUsed/>
   </w:style>
   <w:style w:type="paragraph" w:styleId="Title">
     <w:name w:val="Title"/>
@@ -12206,7 +12255,7 @@
 </file>
 
 <file path=customXml/itemProps1.xml><?xml version="1.0" encoding="utf-8"?>
-<ds:datastoreItem xmlns:ds="http://schemas.openxmlformats.org/officeDocument/2006/customXml" ds:itemID="{50619638-AC3A-43FD-A86C-F63D856398EB}">
+<ds:datastoreItem xmlns:ds="http://schemas.openxmlformats.org/officeDocument/2006/customXml" ds:itemID="{E9F7EB7F-7023-44EA-9671-9ADE71EBEE6D}">
   <ds:schemaRefs>
     <ds:schemaRef ds:uri="http://schemas.openxmlformats.org/officeDocument/2006/bibliography"/>
   </ds:schemaRefs>

</xml_diff>